<commit_message>
changed db + models, added admin panel, small code and style fixes
</commit_message>
<xml_diff>
--- a/Documents/KnowledgeBase/функциональные требования.docx
+++ b/Documents/KnowledgeBase/функциональные требования.docx
@@ -36,6 +36,7 @@
           <w:rFonts w:ascii="Times New Roman" w:hAnsi="Times New Roman" w:cs="Times New Roman"/>
           <w:sz w:val="28"/>
           <w:szCs w:val="28"/>
+          <w:highlight w:val="cyan"/>
         </w:rPr>
       </w:pPr>
       <w:r>
@@ -129,6 +130,14 @@
           <w:szCs w:val="28"/>
         </w:rPr>
         <w:br/>
+      </w:r>
+      <w:r>
+        <w:rPr>
+          <w:rFonts w:ascii="Times New Roman" w:hAnsi="Times New Roman" w:cs="Times New Roman"/>
+          <w:sz w:val="28"/>
+          <w:szCs w:val="28"/>
+          <w:highlight w:val="cyan"/>
+        </w:rPr>
         <w:t>1.7. Система должна позволять соискателю загружать и изменять фотографию в своем профиле.</w:t>
       </w:r>
     </w:p>
@@ -348,6 +357,14 @@
           <w:szCs w:val="28"/>
         </w:rPr>
         <w:br/>
+      </w:r>
+      <w:r>
+        <w:rPr>
+          <w:rFonts w:ascii="Times New Roman" w:hAnsi="Times New Roman" w:cs="Times New Roman"/>
+          <w:sz w:val="28"/>
+          <w:szCs w:val="28"/>
+          <w:highlight w:val="green"/>
+        </w:rPr>
         <w:t>3.6. Система должна позволять соискателю получать и просматривать приглашения от работодателей.</w:t>
       </w:r>
       <w:r>
@@ -476,6 +493,7 @@
           <w:rFonts w:ascii="Times New Roman" w:hAnsi="Times New Roman" w:cs="Times New Roman"/>
           <w:sz w:val="28"/>
           <w:szCs w:val="28"/>
+          <w:highlight w:val="green"/>
         </w:rPr>
       </w:pPr>
       <w:r>
@@ -495,6 +513,14 @@
           <w:szCs w:val="28"/>
         </w:rPr>
         <w:br/>
+      </w:r>
+      <w:r>
+        <w:rPr>
+          <w:rFonts w:ascii="Times New Roman" w:hAnsi="Times New Roman" w:cs="Times New Roman"/>
+          <w:sz w:val="28"/>
+          <w:szCs w:val="28"/>
+          <w:highlight w:val="green"/>
+        </w:rPr>
         <w:t>5.1. Система должна предоставлять форму регистрации для работодателя, включающую поля: Email, Пароль, Название компании, ИНН, Контактное лицо.</w:t>
       </w:r>
       <w:r>
@@ -504,6 +530,14 @@
           <w:szCs w:val="28"/>
         </w:rPr>
         <w:br/>
+      </w:r>
+      <w:r>
+        <w:rPr>
+          <w:rFonts w:ascii="Times New Roman" w:hAnsi="Times New Roman" w:cs="Times New Roman"/>
+          <w:sz w:val="28"/>
+          <w:szCs w:val="28"/>
+          <w:highlight w:val="green"/>
+        </w:rPr>
         <w:t>5.2. Система должна требовать от работодателя пройти процедуру подтверждения компании, которая будет верифицироваться администратором.</w:t>
       </w:r>
     </w:p>
@@ -539,6 +573,14 @@
           <w:szCs w:val="28"/>
         </w:rPr>
         <w:br/>
+      </w:r>
+      <w:r>
+        <w:rPr>
+          <w:rFonts w:ascii="Times New Roman" w:hAnsi="Times New Roman" w:cs="Times New Roman"/>
+          <w:sz w:val="28"/>
+          <w:szCs w:val="28"/>
+          <w:highlight w:val="green"/>
+        </w:rPr>
         <w:t>6.1. Система должна предоставлять работодателю форму для создания новой вакансии с полями: Название должности, Сфера деятельности, Требуемый опыт, График работы, Зарплата (от/до), Описание вакансии, Требования к кандидату, Условия работы.</w:t>
       </w:r>
       <w:r>
@@ -546,6 +588,7 @@
           <w:rFonts w:ascii="Times New Roman" w:hAnsi="Times New Roman" w:cs="Times New Roman"/>
           <w:sz w:val="28"/>
           <w:szCs w:val="28"/>
+          <w:highlight w:val="green"/>
         </w:rPr>
         <w:br/>
         <w:t>6.2. Система должна позволять работодателю публиковать вакансию, делая ее видимой для всех соискателей.</w:t>
@@ -555,6 +598,7 @@
           <w:rFonts w:ascii="Times New Roman" w:hAnsi="Times New Roman" w:cs="Times New Roman"/>
           <w:sz w:val="28"/>
           <w:szCs w:val="28"/>
+          <w:highlight w:val="green"/>
         </w:rPr>
         <w:br/>
         <w:t>6.3. Система должна позволять работодателю редактировать все поля опубликованной вакансии.</w:t>
@@ -564,6 +608,7 @@
           <w:rFonts w:ascii="Times New Roman" w:hAnsi="Times New Roman" w:cs="Times New Roman"/>
           <w:sz w:val="28"/>
           <w:szCs w:val="28"/>
+          <w:highlight w:val="green"/>
         </w:rPr>
         <w:br/>
         <w:t>6.4. Система должна позволять работодателю снимать вакансию с публикации (архивировать), скрывая ее из поиска.</w:t>
@@ -786,6 +831,14 @@
           <w:szCs w:val="28"/>
         </w:rPr>
         <w:br/>
+      </w:r>
+      <w:r>
+        <w:rPr>
+          <w:rFonts w:ascii="Times New Roman" w:hAnsi="Times New Roman" w:cs="Times New Roman"/>
+          <w:sz w:val="28"/>
+          <w:szCs w:val="28"/>
+          <w:highlight w:val="green"/>
+        </w:rPr>
         <w:t>9.1. Система должна предоставлять администратору интерфейс для модерации (одобрения или отклонения) новых вакансий.</w:t>
       </w:r>
       <w:r>
@@ -793,6 +846,7 @@
           <w:rFonts w:ascii="Times New Roman" w:hAnsi="Times New Roman" w:cs="Times New Roman"/>
           <w:sz w:val="28"/>
           <w:szCs w:val="28"/>
+          <w:highlight w:val="green"/>
         </w:rPr>
         <w:br/>
         <w:t>9.2. Система должна предоставлять администратору интерфейс для модерации резюме и профилей компаний (например, по жалобам пользователей).</w:t>
@@ -802,9 +856,18 @@
           <w:rFonts w:ascii="Times New Roman" w:hAnsi="Times New Roman" w:cs="Times New Roman"/>
           <w:sz w:val="28"/>
           <w:szCs w:val="28"/>
+          <w:highlight w:val="green"/>
         </w:rPr>
         <w:br/>
-        <w:t>9.3. Система должна позволять администратору подтверждать регистрацию новых компаний.</w:t>
+        <w:t>9.3. Система должна позволять администратору подтверждать регистрацию новых компаний</w:t>
+      </w:r>
+      <w:r>
+        <w:rPr>
+          <w:rFonts w:ascii="Times New Roman" w:hAnsi="Times New Roman" w:cs="Times New Roman"/>
+          <w:sz w:val="28"/>
+          <w:szCs w:val="28"/>
+        </w:rPr>
+        <w:t>.</w:t>
       </w:r>
     </w:p>
     <w:p>
@@ -855,6 +918,14 @@
           <w:szCs w:val="28"/>
         </w:rPr>
         <w:br/>
+      </w:r>
+      <w:r>
+        <w:rPr>
+          <w:rFonts w:ascii="Times New Roman" w:hAnsi="Times New Roman" w:cs="Times New Roman"/>
+          <w:sz w:val="28"/>
+          <w:szCs w:val="28"/>
+          <w:highlight w:val="green"/>
+        </w:rPr>
         <w:t>10.2. Система должна позволять администратору блокировать учетные записи пользователей-нарушителей.</w:t>
       </w:r>
       <w:r>

</xml_diff>